<commit_message>
feat: add security module with authentication, users and catalogs
</commit_message>
<xml_diff>
--- a/docs/ERS_SGIG_v3.docx
+++ b/docs/ERS_SGIG_v3.docx
@@ -549,6 +549,80 @@
           </w:p>
         </w:tc>
       </w:tr>
+      <w:tr>
+        <w:trPr>
+          <w:cantSplit/>
+        </w:trPr>
+        <w:tc>
+          <w:tcPr>
+            <w:tcW w:type="dxa" w:w="1400"/>
+            <w:tcMar>
+              <w:top w:type="dxa" w:w="70"/>
+              <w:left w:type="dxa" w:w="100"/>
+              <w:bottom w:type="dxa" w:w="70"/>
+              <w:right w:type="dxa" w:w="100"/>
+            </w:tcMar>
+          </w:tcPr>
+          <w:p>
+            <w:r>
+              <w:rPr>
+                <w:b w:val="false"/>
+                <w:bCs w:val="false"/>
+                <w:color w:val="000000"/>
+                <w:sz w:val="19"/>
+                <w:szCs w:val="19"/>
+              </w:rPr>
+              <w:t>3.2</w:t>
+            </w:r>
+          </w:p>
+        </w:tc>
+        <w:tc>
+          <w:tcPr>
+            <w:tcW w:type="dxa" w:w="1800"/>
+            <w:tcMar>
+              <w:top w:type="dxa" w:w="70"/>
+              <w:left w:type="dxa" w:w="100"/>
+              <w:bottom w:type="dxa" w:w="70"/>
+              <w:right w:type="dxa" w:w="100"/>
+            </w:tcMar>
+          </w:tcPr>
+          <w:p>
+            <w:r>
+              <w:rPr>
+                <w:b w:val="false"/>
+                <w:bCs w:val="false"/>
+                <w:color w:val="000000"/>
+                <w:sz w:val="19"/>
+                <w:szCs w:val="19"/>
+              </w:rPr>
+              <w:t>28/08/2026</w:t>
+            </w:r>
+          </w:p>
+        </w:tc>
+        <w:tc>
+          <w:tcPr>
+            <w:tcW w:type="dxa" w:w="6220"/>
+            <w:tcMar>
+              <w:top w:type="dxa" w:w="70"/>
+              <w:left w:type="dxa" w:w="100"/>
+              <w:bottom w:type="dxa" w:w="70"/>
+              <w:right w:type="dxa" w:w="100"/>
+            </w:tcMar>
+          </w:tcPr>
+          <w:p>
+            <w:r>
+              <w:rPr>
+                <w:b w:val="false"/>
+                <w:bCs w:val="false"/>
+                <w:color w:val="000000"/>
+                <w:sz w:val="19"/>
+                <w:szCs w:val="19"/>
+              </w:rPr>
+              <w:t>Baja lógica en tablas paramétricas. Se agrega el campo «activo» a Rol, Provincia, Localidad, TipoDocumento y MedioPago, y se precisa el RF#04: la baja de los catálogos es lógica, nunca física. No cambian los roles, las historias de usuario ni la arquitectura.</w:t>
+            </w:r>
+          </w:p>
+        </w:tc>
+      </w:tr>
     </w:tbl>
     <w:p>
       <w:pPr>
@@ -3020,7 +3094,7 @@
                 <w:sz w:val="19"/>
                 <w:szCs w:val="19"/>
               </w:rPr>
-              <w:t xml:space="preserve">El sistema debe permitir realizar operaciones CRUD sobre las tablas paramétricas: Localidades, Provincias, Roles, Tipos de Documento y Medios de Pago.</w:t>
+              <w:t>El sistema debe permitir realizar operaciones CRUD sobre las tablas paramétricas: Localidades, Provincias, Roles, Tipos de Documento y Medios de Pago. La baja de estos catálogos debe ser siempre lógica (campo «activo»), nunca un borrado físico, para preservar la integridad de los registros históricos que los referencian.</w:t>
             </w:r>
           </w:p>
         </w:tc>

</xml_diff>